<commit_message>
Kim11-2-7-Asit-Baz-Teorileri: gorsel alanlarina Shutter onizlemeleri yerlestirildi (2.3 bicimi)
</commit_message>
<xml_diff>
--- a/Kim11-2-7-Asit-Baz-Teorileri.docx
+++ b/Kim11-2-7-Asit-Baz-Teorileri.docx
@@ -92,77 +92,60 @@
           <w:tcPr>
             <w:tcW w:w="4500" w:type="dxa"/>
           </w:tcPr>
-          <w:tbl>
-            <w:tblPr>
-              <w:tblW w:w="4300" w:type="dxa"/>
+          <w:p>
+            <w:pPr>
               <w:jc w:val="center"/>
-              <w:tblBorders>
-                <w:top w:val="single" w:sz="8" w:space="0" w:color="7F7F7F"/>
-                <w:left w:val="single" w:sz="8" w:space="0" w:color="7F7F7F"/>
-                <w:bottom w:val="single" w:sz="8" w:space="0" w:color="7F7F7F"/>
-                <w:right w:val="single" w:sz="8" w:space="0" w:color="7F7F7F"/>
-              </w:tblBorders>
-            </w:tblPr>
-            <w:tblGrid>
-              <w:gridCol w:w="4300"/>
-            </w:tblGrid>
-            <w:tr>
-              <w:tc>
-                <w:tcPr>
-                  <w:tcW w:w="4300" w:type="dxa"/>
-                  <w:shd w:val="clear" w:color="auto" w:fill="EDEDED"/>
-                </w:tcPr>
-                <w:p>
-                  <w:pPr>
-                    <w:jc w:val="both"/>
-                    <w:rPr>
-                      <w:rFonts w:ascii="Times New Roman" w:hAnsi="Times New Roman" w:cs="Times New Roman"/>
-                      <w:lang w:val="tr-TR"/>
-                    </w:rPr>
-                  </w:pPr>
-                  <w:r>
-                    <w:rPr>
-                      <w:rFonts w:ascii="Times New Roman" w:hAnsi="Times New Roman" w:cs="Times New Roman"/>
-                      <w:lang w:val="tr-TR"/>
-                    </w:rPr>
-                    <w:t xml:space="preserve">GÖRSEL ALANI (Shutterstock)</w:t>
-                  </w:r>
-                </w:p>
-                <w:p>
-                  <w:pPr>
-                    <w:jc w:val="both"/>
-                    <w:rPr>
-                      <w:rFonts w:ascii="Times New Roman" w:hAnsi="Times New Roman" w:cs="Times New Roman"/>
-                      <w:lang w:val="tr-TR"/>
-                    </w:rPr>
-                  </w:pPr>
-                  <w:r>
-                    <w:rPr>
-                      <w:rFonts w:ascii="Times New Roman" w:hAnsi="Times New Roman" w:cs="Times New Roman"/>
-                      <w:lang w:val="tr-TR"/>
-                    </w:rPr>
-                    <w:t xml:space="preserve">Tarif: Kesilmiş limon, kalıp sabunlar ve pompalı sıvı sabun şişesi; marka görünmeyen.</w:t>
-                  </w:r>
-                </w:p>
-                <w:p>
-                  <w:pPr>
-                    <w:jc w:val="both"/>
-                    <w:rPr>
-                      <w:rFonts w:ascii="Times New Roman" w:hAnsi="Times New Roman" w:cs="Times New Roman"/>
-                      <w:lang w:val="tr-TR"/>
-                    </w:rPr>
-                  </w:pPr>
-                  <w:r>
-                    <w:rPr>
-                      <w:rFonts w:ascii="Times New Roman" w:hAnsi="Times New Roman" w:cs="Times New Roman"/>
-                      <w:lang w:val="tr-TR"/>
-                    </w:rPr>
-                    <w:t xml:space="preserve">Shutter ID: 2475259167 (fotoğraf) — Soap in bottle with dispenser, bars of soap and lemon</w:t>
-                  </w:r>
-                </w:p>
-              </w:tc>
-            </w:tr>
-          </w:tbl>
+            </w:pPr>
+            <w:r>
+              <w:drawing>
+                <wp:inline xmlns:a="http://schemas.openxmlformats.org/drawingml/2006/main" xmlns:pic="http://schemas.openxmlformats.org/drawingml/2006/picture">
+                  <wp:extent cx="2664000" cy="1951824"/>
+                  <wp:docPr id="900008" name="Picture 900008"/>
+                  <wp:cNvGraphicFramePr>
+                    <a:graphicFrameLocks noChangeAspect="1"/>
+                  </wp:cNvGraphicFramePr>
+                  <a:graphic>
+                    <a:graphicData uri="http://schemas.openxmlformats.org/drawingml/2006/picture">
+                      <pic:pic>
+                        <pic:nvPicPr>
+                          <pic:cNvPr id="0" name="2475259167_d.jpg"/>
+                          <pic:cNvPicPr/>
+                        </pic:nvPicPr>
+                        <pic:blipFill>
+                          <a:blip r:embed="rId11"/>
+                          <a:stretch>
+                            <a:fillRect/>
+                          </a:stretch>
+                        </pic:blipFill>
+                        <pic:spPr>
+                          <a:xfrm>
+                            <a:off x="0" y="0"/>
+                            <a:ext cx="2664000" cy="1951824"/>
+                          </a:xfrm>
+                          <a:prstGeom prst="rect"/>
+                        </pic:spPr>
+                      </pic:pic>
+                    </a:graphicData>
+                  </a:graphic>
+                </wp:inline>
+              </w:drawing>
+            </w:r>
+          </w:p>
+          <w:p>
+            <w:pPr>
+              <w:jc w:val="center"/>
+            </w:pPr>
+            <w:r>
+              <w:rPr>
+                <w:rFonts w:ascii="Times New Roman" w:hAnsi="Times New Roman" w:cs="Times New Roman"/>
+                <w:b/>
+                <w:bCs/>
+                <w:highlight w:val="yellow"/>
+                <w:lang w:val="tr-TR"/>
+              </w:rPr>
+              <w:t xml:space="preserve">Shutter id: 2475259167</w:t>
+            </w:r>
+          </w:p>
           <w:p>
             <w:pPr>
               <w:jc w:val="center"/>
@@ -193,77 +176,60 @@
           <w:tcPr>
             <w:tcW w:w="4500" w:type="dxa"/>
           </w:tcPr>
-          <w:tbl>
-            <w:tblPr>
-              <w:tblW w:w="4300" w:type="dxa"/>
+          <w:p>
+            <w:pPr>
               <w:jc w:val="center"/>
-              <w:tblBorders>
-                <w:top w:val="single" w:sz="8" w:space="0" w:color="7F7F7F"/>
-                <w:left w:val="single" w:sz="8" w:space="0" w:color="7F7F7F"/>
-                <w:bottom w:val="single" w:sz="8" w:space="0" w:color="7F7F7F"/>
-                <w:right w:val="single" w:sz="8" w:space="0" w:color="7F7F7F"/>
-              </w:tblBorders>
-            </w:tblPr>
-            <w:tblGrid>
-              <w:gridCol w:w="4300"/>
-            </w:tblGrid>
-            <w:tr>
-              <w:tc>
-                <w:tcPr>
-                  <w:tcW w:w="4300" w:type="dxa"/>
-                  <w:shd w:val="clear" w:color="auto" w:fill="EDEDED"/>
-                </w:tcPr>
-                <w:p>
-                  <w:pPr>
-                    <w:jc w:val="both"/>
-                    <w:rPr>
-                      <w:rFonts w:ascii="Times New Roman" w:hAnsi="Times New Roman" w:cs="Times New Roman"/>
-                      <w:lang w:val="tr-TR"/>
-                    </w:rPr>
-                  </w:pPr>
-                  <w:r>
-                    <w:rPr>
-                      <w:rFonts w:ascii="Times New Roman" w:hAnsi="Times New Roman" w:cs="Times New Roman"/>
-                      <w:lang w:val="tr-TR"/>
-                    </w:rPr>
-                    <w:t xml:space="preserve">GÖRSEL ALANI (Shutterstock)</w:t>
-                  </w:r>
-                </w:p>
-                <w:p>
-                  <w:pPr>
-                    <w:jc w:val="both"/>
-                    <w:rPr>
-                      <w:rFonts w:ascii="Times New Roman" w:hAnsi="Times New Roman" w:cs="Times New Roman"/>
-                      <w:lang w:val="tr-TR"/>
-                    </w:rPr>
-                  </w:pPr>
-                  <w:r>
-                    <w:rPr>
-                      <w:rFonts w:ascii="Times New Roman" w:hAnsi="Times New Roman" w:cs="Times New Roman"/>
-                      <w:lang w:val="tr-TR"/>
-                    </w:rPr>
-                    <w:t xml:space="preserve">Tarif: Birine derişik HCl, diğerine derişik NH₃ çözeltisi emdirilmiş pamuk konmuş cam bir borunun ortasında oluşan beyaz NH₄Cl halkası/dumanı (klasik gösteri deneyi).</w:t>
-                  </w:r>
-                </w:p>
-                <w:p>
-                  <w:pPr>
-                    <w:jc w:val="both"/>
-                    <w:rPr>
-                      <w:rFonts w:ascii="Times New Roman" w:hAnsi="Times New Roman" w:cs="Times New Roman"/>
-                      <w:lang w:val="tr-TR"/>
-                    </w:rPr>
-                  </w:pPr>
-                  <w:r>
-                    <w:rPr>
-                      <w:rFonts w:ascii="Times New Roman" w:hAnsi="Times New Roman" w:cs="Times New Roman"/>
-                      <w:lang w:val="tr-TR"/>
-                    </w:rPr>
-                    <w:t xml:space="preserve">Shutter ID: 785009308 (fotoğraf) — Chemical experiment - misty ammonium chloride</w:t>
-                  </w:r>
-                </w:p>
-              </w:tc>
-            </w:tr>
-          </w:tbl>
+            </w:pPr>
+            <w:r>
+              <w:drawing>
+                <wp:inline xmlns:a="http://schemas.openxmlformats.org/drawingml/2006/main" xmlns:pic="http://schemas.openxmlformats.org/drawingml/2006/picture">
+                  <wp:extent cx="2664000" cy="1752912"/>
+                  <wp:docPr id="900009" name="Picture 900009"/>
+                  <wp:cNvGraphicFramePr>
+                    <a:graphicFrameLocks noChangeAspect="1"/>
+                  </wp:cNvGraphicFramePr>
+                  <a:graphic>
+                    <a:graphicData uri="http://schemas.openxmlformats.org/drawingml/2006/picture">
+                      <pic:pic>
+                        <pic:nvPicPr>
+                          <pic:cNvPr id="0" name="785009308_d.jpg"/>
+                          <pic:cNvPicPr/>
+                        </pic:nvPicPr>
+                        <pic:blipFill>
+                          <a:blip r:embed="rId12"/>
+                          <a:stretch>
+                            <a:fillRect/>
+                          </a:stretch>
+                        </pic:blipFill>
+                        <pic:spPr>
+                          <a:xfrm>
+                            <a:off x="0" y="0"/>
+                            <a:ext cx="2664000" cy="1752912"/>
+                          </a:xfrm>
+                          <a:prstGeom prst="rect"/>
+                        </pic:spPr>
+                      </pic:pic>
+                    </a:graphicData>
+                  </a:graphic>
+                </wp:inline>
+              </w:drawing>
+            </w:r>
+          </w:p>
+          <w:p>
+            <w:pPr>
+              <w:jc w:val="center"/>
+            </w:pPr>
+            <w:r>
+              <w:rPr>
+                <w:rFonts w:ascii="Times New Roman" w:hAnsi="Times New Roman" w:cs="Times New Roman"/>
+                <w:b/>
+                <w:bCs/>
+                <w:highlight w:val="yellow"/>
+                <w:lang w:val="tr-TR"/>
+              </w:rPr>
+              <w:t xml:space="preserve">Shutter id: 785009308</w:t>
+            </w:r>
+          </w:p>
           <w:p>
             <w:pPr>
               <w:jc w:val="center"/>
@@ -4725,85 +4691,59 @@
         <w:t xml:space="preserve">O(s) → 2NaOH(suda)</w:t>
       </w:r>
     </w:p>
-    <w:tbl>
-      <w:tblPr>
-        <w:tblW w:w="9000" w:type="dxa"/>
+    <w:p>
+      <w:pPr>
         <w:jc w:val="center"/>
-        <w:tblBorders>
-          <w:top w:val="single" w:sz="8" w:space="0" w:color="7F7F7F"/>
-          <w:left w:val="single" w:sz="8" w:space="0" w:color="7F7F7F"/>
-          <w:bottom w:val="single" w:sz="8" w:space="0" w:color="7F7F7F"/>
-          <w:right w:val="single" w:sz="8" w:space="0" w:color="7F7F7F"/>
-        </w:tblBorders>
-      </w:tblPr>
-      <w:tblGrid>
-        <w:gridCol w:w="9000"/>
-      </w:tblGrid>
-      <w:tr>
-        <w:tc>
-          <w:tcPr>
-            <w:tcW w:w="9000" w:type="dxa"/>
-            <w:shd w:val="clear" w:color="auto" w:fill="EDEDED"/>
-          </w:tcPr>
-          <w:p>
-            <w:pPr>
-              <w:jc w:val="both"/>
-              <w:rPr>
-                <w:rFonts w:ascii="Times New Roman" w:hAnsi="Times New Roman" w:cs="Times New Roman"/>
-                <w:lang w:val="tr-TR"/>
-              </w:rPr>
-            </w:pPr>
-            <w:r>
-              <w:rPr>
-                <w:rFonts w:ascii="Times New Roman" w:hAnsi="Times New Roman" w:cs="Times New Roman"/>
-                <w:lang w:val="tr-TR"/>
-              </w:rPr>
-              <w:t xml:space="preserve">GÖRSEL ALANI (Shutterstock)</w:t>
-            </w:r>
-          </w:p>
-          <w:p>
-            <w:pPr>
-              <w:jc w:val="both"/>
-              <w:rPr>
-                <w:rFonts w:ascii="Times New Roman" w:hAnsi="Times New Roman" w:cs="Times New Roman"/>
-                <w:lang w:val="tr-TR"/>
-              </w:rPr>
-            </w:pPr>
-            <w:r>
-              <w:rPr>
-                <w:rFonts w:ascii="Times New Roman" w:hAnsi="Times New Roman" w:cs="Times New Roman"/>
-                <w:lang w:val="tr-TR"/>
-              </w:rPr>
-              <w:t xml:space="preserve">Tarif: Asit yağmurları nedeniyle yaprakları dökülmüş, kurumuş ağaçların bulunduğu bir orman ya da aşınmış mermer heykel.</w:t>
-            </w:r>
-          </w:p>
-          <w:p>
-            <w:pPr>
-              <w:jc w:val="both"/>
-              <w:rPr>
-                <w:rFonts w:ascii="Times New Roman" w:hAnsi="Times New Roman" w:cs="Times New Roman"/>
-                <w:lang w:val="tr-TR"/>
-              </w:rPr>
-            </w:pPr>
-            <w:r>
-              <w:rPr>
-                <w:rFonts w:ascii="Times New Roman" w:hAnsi="Times New Roman" w:cs="Times New Roman"/>
-                <w:lang w:val="tr-TR"/>
-              </w:rPr>
-              <w:t xml:space="preserve">Shutter ID: 2829837163 (fotoğraf) — Acid rain damage, Appalachian mountains</w:t>
-            </w:r>
-          </w:p>
-        </w:tc>
-      </w:tr>
-    </w:tbl>
+      </w:pPr>
+      <w:r>
+        <w:drawing>
+          <wp:inline xmlns:a="http://schemas.openxmlformats.org/drawingml/2006/main" xmlns:pic="http://schemas.openxmlformats.org/drawingml/2006/picture">
+            <wp:extent cx="3070674" cy="2520000"/>
+            <wp:docPr id="900010" name="Picture 900010"/>
+            <wp:cNvGraphicFramePr>
+              <a:graphicFrameLocks noChangeAspect="1"/>
+            </wp:cNvGraphicFramePr>
+            <a:graphic>
+              <a:graphicData uri="http://schemas.openxmlformats.org/drawingml/2006/picture">
+                <pic:pic>
+                  <pic:nvPicPr>
+                    <pic:cNvPr id="0" name="2829837163_d.jpg"/>
+                    <pic:cNvPicPr/>
+                  </pic:nvPicPr>
+                  <pic:blipFill>
+                    <a:blip r:embed="rId13"/>
+                    <a:stretch>
+                      <a:fillRect/>
+                    </a:stretch>
+                  </pic:blipFill>
+                  <pic:spPr>
+                    <a:xfrm>
+                      <a:off x="0" y="0"/>
+                      <a:ext cx="3070674" cy="2520000"/>
+                    </a:xfrm>
+                    <a:prstGeom prst="rect"/>
+                  </pic:spPr>
+                </pic:pic>
+              </a:graphicData>
+            </a:graphic>
+          </wp:inline>
+        </w:drawing>
+      </w:r>
+    </w:p>
     <w:p>
       <w:pPr>
-        <w:jc w:val="both"/>
-        <w:rPr>
-          <w:rFonts w:ascii="Times New Roman" w:hAnsi="Times New Roman" w:cs="Times New Roman"/>
-          <w:lang w:val="tr-TR"/>
-        </w:rPr>
-      </w:pPr>
+        <w:jc w:val="center"/>
+      </w:pPr>
+      <w:r>
+        <w:rPr>
+          <w:rFonts w:ascii="Times New Roman" w:hAnsi="Times New Roman" w:cs="Times New Roman"/>
+          <w:b/>
+          <w:bCs/>
+          <w:highlight w:val="yellow"/>
+          <w:lang w:val="tr-TR"/>
+        </w:rPr>
+        <w:t xml:space="preserve">Shutter id: 2829837163</w:t>
+      </w:r>
     </w:p>
     <w:p>
       <w:pPr>

</xml_diff>

<commit_message>
2.7: HCl/NH3 proton aktarimi uzay dolgu gorseli yeniden cizildi; NH4+ dort H atomuyla, tum tanecikler atomlari gorunecek yonde, baski boyutunda
</commit_message>
<xml_diff>
--- a/Kim11-2-7-Asit-Baz-Teorileri.docx
+++ b/Kim11-2-7-Asit-Baz-Teorileri.docx
@@ -1038,7 +1038,7 @@
       <w:r>
         <w:drawing>
           <wp:inline distT="0" distB="0" distL="0" distR="0">
-            <wp:extent cx="5040000" cy="2622516"/>
+            <wp:extent cx="5038354" cy="2374396"/>
             <wp:docPr id="900001" name="Grafik 900001" descr="Proton aktarımı uzay dolgu modeli"/>
             <wp:cNvGraphicFramePr>
               <a:graphicFrameLocks noChangeAspect="1"/>
@@ -1059,7 +1059,7 @@
                   <pic:spPr>
                     <a:xfrm>
                       <a:off x="0" y="0"/>
-                      <a:ext cx="5040000" cy="2622516"/>
+                      <a:ext cx="5038354" cy="2374396"/>
                     </a:xfrm>
                     <a:prstGeom prst="rect">
                       <a:avLst/>

</xml_diff>